<commit_message>
Actualizar informe Entrega 1 con sección GitHub y DVC
</commit_message>
<xml_diff>
--- a/entregas/entrega_1/informe/Reporte_Entrega1.docx
+++ b/entregas/entrega_1/informe/Reporte_Entrega1.docx
@@ -793,23 +793,7 @@
           <w:sz w:val="22"/>
           <w:szCs w:val="22"/>
         </w:rPr>
-        <w:t xml:space="preserve">Resultado esperado: una comparación entre el modelo A (solo variables del crédito) y el modelo B (crédito más ahorro y empleo del hogar), evaluada con una división por hogar y métricas apropiadas para clases desbalanceadas (por ejemplo, </w:t>
-      </w:r>
-      <w:proofErr w:type="spellStart"/>
-      <w:r>
-        <w:rPr>
-          <w:sz w:val="22"/>
-          <w:szCs w:val="22"/>
-        </w:rPr>
-        <w:t>recall</w:t>
-      </w:r>
-      <w:proofErr w:type="spellEnd"/>
-      <w:r>
-        <w:rPr>
-          <w:sz w:val="22"/>
-          <w:szCs w:val="22"/>
-        </w:rPr>
-        <w:t xml:space="preserve"> y F1 de la clase “con retrasos”). La pregunta se responde según si el modelo B mejora de forma consistente esas métricas frente al A.</w:t>
+        <w:t>Resultado esperado: una comparación entre el modelo A (solo variables del crédito) y el modelo B (crédito más ahorro y empleo del hogar), evaluada con una división por hogar y métricas apropiadas para clases desbalanceadas (por ejemplo, recall y F1 de la clase “con retrasos”). La pregunta se responde según si el modelo B mejora de forma consistente esas métricas frente al A.</w:t>
       </w:r>
     </w:p>
     <w:p>
@@ -851,23 +835,7 @@
           <w:sz w:val="22"/>
           <w:szCs w:val="22"/>
         </w:rPr>
-        <w:t xml:space="preserve">Fuera del alcance: inferencia causal y uso como instrumento operativo de aprobación o </w:t>
-      </w:r>
-      <w:proofErr w:type="spellStart"/>
-      <w:r>
-        <w:rPr>
-          <w:sz w:val="22"/>
-          <w:szCs w:val="22"/>
-        </w:rPr>
-        <w:t>scoring</w:t>
-      </w:r>
-      <w:proofErr w:type="spellEnd"/>
-      <w:r>
-        <w:rPr>
-          <w:sz w:val="22"/>
-          <w:szCs w:val="22"/>
-        </w:rPr>
-        <w:t xml:space="preserve"> de crédito.</w:t>
+        <w:t>Fuera del alcance: inferencia causal y uso como instrumento operativo de aprobación o scoring de crédito.</w:t>
       </w:r>
     </w:p>
     <w:p>
@@ -2470,23 +2438,7 @@
           <w:sz w:val="22"/>
           <w:szCs w:val="22"/>
         </w:rPr>
-        <w:t xml:space="preserve">Además de las variables de crédito, que se conservan tal como las publica el DANE (ver Anexo A), la base incluye ocho columnas elaboradas por el equipo. La primera es la variable objetivo, </w:t>
-      </w:r>
-      <w:proofErr w:type="spellStart"/>
-      <w:r>
-        <w:rPr>
-          <w:sz w:val="22"/>
-          <w:szCs w:val="22"/>
-        </w:rPr>
-        <w:t>objetivo_atraso</w:t>
-      </w:r>
-      <w:proofErr w:type="spellEnd"/>
-      <w:r>
-        <w:rPr>
-          <w:sz w:val="22"/>
-          <w:szCs w:val="22"/>
-        </w:rPr>
-        <w:t>, que toma el valor 1 cuando el hogar reporta no estar al día en el pago del crédito y 0 cuando sí lo está. Los otros siete</w:t>
+        <w:t>Además de las variables de crédito, que se conservan tal como las publica el DANE (ver Anexo A), la base incluye ocho columnas elaboradas por el equipo. La primera es la variable objetivo, objetivo_atraso, que toma el valor 1 cuando el hogar reporta no estar al día en el pago del crédito y 0 cuando sí lo está. Los otros siete</w:t>
       </w:r>
       <w:r>
         <w:rPr>
@@ -2514,119 +2466,7 @@
           <w:sz w:val="22"/>
           <w:szCs w:val="22"/>
         </w:rPr>
-        <w:t>por hogar la información de las tablas de ahorro y mercado laboral, de modo que cada crédito conserve una sola fila. Desde P_AHORRO se calcularon el número de personas del hogar registradas en la tabla (</w:t>
-      </w:r>
-      <w:proofErr w:type="spellStart"/>
-      <w:r>
-        <w:rPr>
-          <w:sz w:val="22"/>
-          <w:szCs w:val="22"/>
-        </w:rPr>
-        <w:t>n_personas_ahorro</w:t>
-      </w:r>
-      <w:proofErr w:type="spellEnd"/>
-      <w:r>
-        <w:rPr>
-          <w:sz w:val="22"/>
-          <w:szCs w:val="22"/>
-        </w:rPr>
-        <w:t>), el número de personas con ingresos (</w:t>
-      </w:r>
-      <w:proofErr w:type="spellStart"/>
-      <w:r>
-        <w:rPr>
-          <w:sz w:val="22"/>
-          <w:szCs w:val="22"/>
-        </w:rPr>
-        <w:t>n_personas_con_ingresos</w:t>
-      </w:r>
-      <w:proofErr w:type="spellEnd"/>
-      <w:r>
-        <w:rPr>
-          <w:sz w:val="22"/>
-          <w:szCs w:val="22"/>
-        </w:rPr>
-        <w:t>), el número de personas que ahorran (</w:t>
-      </w:r>
-      <w:proofErr w:type="spellStart"/>
-      <w:r>
-        <w:rPr>
-          <w:sz w:val="22"/>
-          <w:szCs w:val="22"/>
-        </w:rPr>
-        <w:t>n_personas_que_ahorran</w:t>
-      </w:r>
-      <w:proofErr w:type="spellEnd"/>
-      <w:r>
-        <w:rPr>
-          <w:sz w:val="22"/>
-          <w:szCs w:val="22"/>
-        </w:rPr>
-        <w:t>), la proporción de personas con ingresos que ahorran (</w:t>
-      </w:r>
-      <w:proofErr w:type="spellStart"/>
-      <w:r>
-        <w:rPr>
-          <w:sz w:val="22"/>
-          <w:szCs w:val="22"/>
-        </w:rPr>
-        <w:t>prop_que_ahorran_sobre_con_ingresos</w:t>
-      </w:r>
-      <w:proofErr w:type="spellEnd"/>
-      <w:r>
-        <w:rPr>
-          <w:sz w:val="22"/>
-          <w:szCs w:val="22"/>
-        </w:rPr>
-        <w:t>) y el número de personas con cuenta financiera (</w:t>
-      </w:r>
-      <w:proofErr w:type="spellStart"/>
-      <w:r>
-        <w:rPr>
-          <w:sz w:val="22"/>
-          <w:szCs w:val="22"/>
-        </w:rPr>
-        <w:t>n_personas_con_cuenta</w:t>
-      </w:r>
-      <w:proofErr w:type="spellEnd"/>
-      <w:r>
-        <w:rPr>
-          <w:sz w:val="22"/>
-          <w:szCs w:val="22"/>
-        </w:rPr>
-        <w:t>). Desde N_MERCADO_LABORAL se calcularon el número de personas del hogar registradas en la tabla (</w:t>
-      </w:r>
-      <w:proofErr w:type="spellStart"/>
-      <w:r>
-        <w:rPr>
-          <w:sz w:val="22"/>
-          <w:szCs w:val="22"/>
-        </w:rPr>
-        <w:t>n_personas_laboral</w:t>
-      </w:r>
-      <w:proofErr w:type="spellEnd"/>
-      <w:r>
-        <w:rPr>
-          <w:sz w:val="22"/>
-          <w:szCs w:val="22"/>
-        </w:rPr>
-        <w:t>) y el número de personas que trabajaron la semana anterior (</w:t>
-      </w:r>
-      <w:proofErr w:type="spellStart"/>
-      <w:r>
-        <w:rPr>
-          <w:sz w:val="22"/>
-          <w:szCs w:val="22"/>
-        </w:rPr>
-        <w:t>n_personas_trabajo_semana</w:t>
-      </w:r>
-      <w:proofErr w:type="spellEnd"/>
-      <w:r>
-        <w:rPr>
-          <w:sz w:val="22"/>
-          <w:szCs w:val="22"/>
-        </w:rPr>
-        <w:t>). La proporción de ahorro queda sin valor en los hogares donde ninguna persona reporta ingresos, por lo que debe tratarse como dato faltante en el modelado.</w:t>
+        <w:t>por hogar la información de las tablas de ahorro y mercado laboral, de modo que cada crédito conserve una sola fila. Desde P_AHORRO se calcularon el número de personas del hogar registradas en la tabla (n_personas_ahorro), el número de personas con ingresos (n_personas_con_ingresos), el número de personas que ahorran (n_personas_que_ahorran), la proporción de personas con ingresos que ahorran (prop_que_ahorran_sobre_con_ingresos) y el número de personas con cuenta financiera (n_personas_con_cuenta). Desde N_MERCADO_LABORAL se calcularon el número de personas del hogar registradas en la tabla (n_personas_laboral) y el número de personas que trabajaron la semana anterior (n_personas_trabajo_semana). La proporción de ahorro queda sin valor en los hogares donde ninguna persona reporta ingresos, por lo que debe tratarse como dato faltante en el modelado.</w:t>
       </w:r>
       <w:r>
         <w:rPr>
@@ -2673,21 +2513,7 @@
           <w:szCs w:val="22"/>
         </w:rPr>
         <w:lastRenderedPageBreak/>
-        <w:t>La exploración busca responder qué características se asocian con el atraso y, en particular, si la información del hogar aporta más allá de la del crédito. Los cálculos son descriptivos, sobre los registros de la base consolidada</w:t>
-      </w:r>
-      <w:r>
-        <w:rPr>
-          <w:sz w:val="22"/>
-          <w:szCs w:val="22"/>
-        </w:rPr>
-        <w:t xml:space="preserve">, </w:t>
-      </w:r>
-      <w:r>
-        <w:rPr>
-          <w:sz w:val="22"/>
-          <w:szCs w:val="22"/>
-        </w:rPr>
-        <w:t>y están reproducidos en el cuaderno del equipo (01_exploracion_consolidacion).</w:t>
+        <w:t>La exploración busca responder qué características se asocian con el atraso y, en particular, si la información del hogar aporta más allá de la del crédito. Los cálculos son descriptivos, sobre los registros de la base consolidada, y están reproducidos en el cuaderno del equipo (01_exploracion_consolidacion).</w:t>
       </w:r>
     </w:p>
     <w:p>
@@ -2830,6 +2656,7 @@
       </w:pPr>
       <w:r>
         <w:rPr>
+          <w:noProof/>
           <w:sz w:val="22"/>
           <w:szCs w:val="22"/>
         </w:rPr>
@@ -2929,6 +2756,7 @@
       </w:pPr>
       <w:r>
         <w:rPr>
+          <w:noProof/>
           <w:sz w:val="22"/>
           <w:szCs w:val="22"/>
         </w:rPr>
@@ -2999,16 +2827,7 @@
           <w:sz w:val="18"/>
           <w:szCs w:val="18"/>
         </w:rPr>
-        <w:t xml:space="preserve">Figura 2. </w:t>
-      </w:r>
-      <w:r>
-        <w:rPr>
-          <w:i/>
-          <w:iCs/>
-          <w:sz w:val="18"/>
-          <w:szCs w:val="18"/>
-        </w:rPr>
-        <w:t>Porcentaje de créditos con retrasos según el acceso del hogar a cuentas financieras</w:t>
+        <w:t>Figura 2. Porcentaje de créditos con retrasos según el acceso del hogar a cuentas financieras</w:t>
       </w:r>
     </w:p>
     <w:p>
@@ -3021,6 +2840,7 @@
       </w:pPr>
       <w:r>
         <w:rPr>
+          <w:noProof/>
           <w:sz w:val="22"/>
           <w:szCs w:val="22"/>
         </w:rPr>
@@ -4310,16 +4130,7 @@
           <w:sz w:val="18"/>
           <w:szCs w:val="18"/>
         </w:rPr>
-        <w:t xml:space="preserve"> </w:t>
-      </w:r>
-      <w:r>
-        <w:rPr>
-          <w:i/>
-          <w:iCs/>
-          <w:sz w:val="18"/>
-          <w:szCs w:val="18"/>
-        </w:rPr>
-        <w:t>Porcentaje de créditos con retrasos según características del hogar</w:t>
+        <w:t xml:space="preserve"> Porcentaje de créditos con retrasos según características del hogar</w:t>
       </w:r>
     </w:p>
     <w:p>
@@ -7564,7 +7375,7 @@
         </w:rPr>
         <w:lastRenderedPageBreak/>
         <w:drawing>
-          <wp:inline distT="0" distB="0" distL="0" distR="0" wp14:anchorId="66E2488F" wp14:editId="43ED74B6">
+          <wp:inline distT="0" distB="0" distL="0" distR="0" wp14:anchorId="66E2488F" wp14:editId="64CBF11D">
             <wp:extent cx="4709956" cy="2628900"/>
             <wp:effectExtent l="0" t="0" r="0" b="0"/>
             <wp:docPr id="2054794216" name="Imagen 8"/>
@@ -8090,59 +7901,7 @@
                 <w:lang w:eastAsia="es-CO"/>
                 <w14:ligatures w14:val="none"/>
               </w:rPr>
-              <w:t xml:space="preserve">Tabla de comparación entre el modelo A y el modelo B con </w:t>
-            </w:r>
-            <w:proofErr w:type="spellStart"/>
-            <w:r>
-              <w:rPr>
-                <w:rFonts w:ascii="Aptos Narrow" w:eastAsia="Times New Roman" w:hAnsi="Aptos Narrow" w:cs="Times New Roman"/>
-                <w:color w:val="000000"/>
-                <w:kern w:val="0"/>
-                <w:sz w:val="18"/>
-                <w:szCs w:val="18"/>
-                <w:lang w:eastAsia="es-CO"/>
-                <w14:ligatures w14:val="none"/>
-              </w:rPr>
-              <w:t>recall</w:t>
-            </w:r>
-            <w:proofErr w:type="spellEnd"/>
-            <w:r>
-              <w:rPr>
-                <w:rFonts w:ascii="Aptos Narrow" w:eastAsia="Times New Roman" w:hAnsi="Aptos Narrow" w:cs="Times New Roman"/>
-                <w:color w:val="000000"/>
-                <w:kern w:val="0"/>
-                <w:sz w:val="18"/>
-                <w:szCs w:val="18"/>
-                <w:lang w:eastAsia="es-CO"/>
-                <w14:ligatures w14:val="none"/>
-              </w:rPr>
-              <w:t xml:space="preserve"> y F1 de la clase con retrasos, PR-AUC y la mejora de B respecto a </w:t>
-            </w:r>
-            <w:proofErr w:type="spellStart"/>
-            <w:r>
-              <w:rPr>
-                <w:rFonts w:ascii="Aptos Narrow" w:eastAsia="Times New Roman" w:hAnsi="Aptos Narrow" w:cs="Times New Roman"/>
-                <w:color w:val="000000"/>
-                <w:kern w:val="0"/>
-                <w:sz w:val="18"/>
-                <w:szCs w:val="18"/>
-                <w:lang w:eastAsia="es-CO"/>
-                <w14:ligatures w14:val="none"/>
-              </w:rPr>
-              <w:t>A</w:t>
-            </w:r>
-            <w:proofErr w:type="spellEnd"/>
-            <w:r>
-              <w:rPr>
-                <w:rFonts w:ascii="Aptos Narrow" w:eastAsia="Times New Roman" w:hAnsi="Aptos Narrow" w:cs="Times New Roman"/>
-                <w:color w:val="000000"/>
-                <w:kern w:val="0"/>
-                <w:sz w:val="18"/>
-                <w:szCs w:val="18"/>
-                <w:lang w:eastAsia="es-CO"/>
-                <w14:ligatures w14:val="none"/>
-              </w:rPr>
-              <w:t>.</w:t>
+              <w:t>Tabla de comparación entre el modelo A y el modelo B con recall y F1 de la clase con retrasos, PR-AUC y la mejora de B respecto a A.</w:t>
             </w:r>
           </w:p>
         </w:tc>
@@ -8302,31 +8061,252 @@
       </w:r>
     </w:p>
     <w:p>
-      <w:pPr>
-        <w:jc w:val="both"/>
-      </w:pPr>
+      <w:r>
+        <w:rPr>
+          <w:b/>
+          <w:sz w:val="22"/>
+        </w:rPr>
+        <w:t>6.1. Repositorio GitHub</w:t>
+      </w:r>
     </w:p>
     <w:p>
-      <w:pPr>
-        <w:jc w:val="both"/>
-      </w:pPr>
+      <w:r>
+        <w:rPr>
+          <w:sz w:val="22"/>
+        </w:rPr>
+        <w:t>Para organizar el trabajo del Grupo 19 se creó el repositorio público Proyecto-Grupo-19 en GitHub. Se definieron carpetas para los datos, cuadernos de análisis, código fuente, API y tablero, además de espacios separados para los informes y evidencias de las tres entregas. Esta organización permite incorporar los componentes del prototipo de manera progresiva.</w:t>
+      </w:r>
     </w:p>
     <w:p>
-      <w:pPr>
-        <w:jc w:val="both"/>
-      </w:pPr>
+      <w:r>
+        <w:rPr>
+          <w:sz w:val="22"/>
+        </w:rPr>
+        <w:t>El repositorio se compartió con los integrantes del grupo para centralizar los archivos, registrar los cambios y facilitar el trabajo colaborativo.</w:t>
+      </w:r>
     </w:p>
     <w:p>
       <w:pPr>
-        <w:jc w:val="both"/>
-      </w:pPr>
+        <w:jc w:val="center"/>
+      </w:pPr>
+      <w:r>
+        <w:rPr>
+          <w:noProof/>
+        </w:rPr>
+        <w:lastRenderedPageBreak/>
+        <w:drawing>
+          <wp:inline distT="0" distB="0" distL="0" distR="0" wp14:anchorId="78799B7C" wp14:editId="6C4EE42C">
+            <wp:extent cx="5212080" cy="2625186"/>
+            <wp:effectExtent l="0" t="0" r="0" b="0"/>
+            <wp:docPr id="2054794217" name="Picture 2054794217"/>
+            <wp:cNvGraphicFramePr>
+              <a:graphicFrameLocks xmlns:a="http://schemas.openxmlformats.org/drawingml/2006/main" noChangeAspect="1"/>
+            </wp:cNvGraphicFramePr>
+            <a:graphic xmlns:a="http://schemas.openxmlformats.org/drawingml/2006/main">
+              <a:graphicData uri="http://schemas.openxmlformats.org/drawingml/2006/picture">
+                <pic:pic xmlns:pic="http://schemas.openxmlformats.org/drawingml/2006/picture">
+                  <pic:nvPicPr>
+                    <pic:cNvPr id="0" name="image.png"/>
+                    <pic:cNvPicPr/>
+                  </pic:nvPicPr>
+                  <pic:blipFill>
+                    <a:blip r:embed="rId10"/>
+                    <a:stretch>
+                      <a:fillRect/>
+                    </a:stretch>
+                  </pic:blipFill>
+                  <pic:spPr>
+                    <a:xfrm>
+                      <a:off x="0" y="0"/>
+                      <a:ext cx="5212080" cy="2625186"/>
+                    </a:xfrm>
+                    <a:prstGeom prst="rect">
+                      <a:avLst/>
+                    </a:prstGeom>
+                  </pic:spPr>
+                </pic:pic>
+              </a:graphicData>
+            </a:graphic>
+          </wp:inline>
+        </w:drawing>
+      </w:r>
     </w:p>
     <w:p>
       <w:pPr>
-        <w:jc w:val="both"/>
-      </w:pPr>
+        <w:jc w:val="center"/>
+      </w:pPr>
+      <w:r>
+        <w:rPr>
+          <w:i/>
+          <w:sz w:val="20"/>
+        </w:rPr>
+        <w:t>Figura 5. Estructura inicial del repositorio Proyecto-Grupo-19 en GitHub.</w:t>
+      </w:r>
     </w:p>
     <w:p>
+      <w:r>
+        <w:rPr>
+          <w:b/>
+          <w:sz w:val="22"/>
+        </w:rPr>
+        <w:t>6.2. Versionamiento de datos con DVC</w:t>
+      </w:r>
+    </w:p>
+    <w:p>
+      <w:r>
+        <w:rPr>
+          <w:sz w:val="22"/>
+        </w:rPr>
+        <w:t>Para llevar el control de la base analítica se inicializó DVC dentro del repositorio y se registró el archivo ELCO_2022_creditos_ahorro_laboral_consolidado.csv. DVC generó un archivo .csv.dvc con la referencia de la versión de los datos y un archivo .gitignore para evitar que el CSV se almacene directamente en GitHub.</w:t>
+      </w:r>
+    </w:p>
+    <w:p>
+      <w:r>
+        <w:rPr>
+          <w:sz w:val="22"/>
+        </w:rPr>
+        <w:t>La base se conserva en los equipos de los integrantes. En esta entrega se verificó el seguimiento local mediante DVC, sin configurar todavía un almacenamiento remoto compartido.</w:t>
+      </w:r>
+    </w:p>
+    <w:p>
+      <w:pPr>
+        <w:jc w:val="center"/>
+      </w:pPr>
+      <w:r>
+        <w:rPr>
+          <w:noProof/>
+        </w:rPr>
+        <w:drawing>
+          <wp:inline distT="0" distB="0" distL="0" distR="0" wp14:anchorId="29945D34" wp14:editId="3BC8590D">
+            <wp:extent cx="5212080" cy="1273767"/>
+            <wp:effectExtent l="0" t="0" r="0" b="0"/>
+            <wp:docPr id="2054794218" name="Picture 2054794218"/>
+            <wp:cNvGraphicFramePr>
+              <a:graphicFrameLocks xmlns:a="http://schemas.openxmlformats.org/drawingml/2006/main" noChangeAspect="1"/>
+            </wp:cNvGraphicFramePr>
+            <a:graphic xmlns:a="http://schemas.openxmlformats.org/drawingml/2006/main">
+              <a:graphicData uri="http://schemas.openxmlformats.org/drawingml/2006/picture">
+                <pic:pic xmlns:pic="http://schemas.openxmlformats.org/drawingml/2006/picture">
+                  <pic:nvPicPr>
+                    <pic:cNvPr id="0" name="image.png"/>
+                    <pic:cNvPicPr/>
+                  </pic:nvPicPr>
+                  <pic:blipFill>
+                    <a:blip r:embed="rId11"/>
+                    <a:stretch>
+                      <a:fillRect/>
+                    </a:stretch>
+                  </pic:blipFill>
+                  <pic:spPr>
+                    <a:xfrm>
+                      <a:off x="0" y="0"/>
+                      <a:ext cx="5212080" cy="1273767"/>
+                    </a:xfrm>
+                    <a:prstGeom prst="rect">
+                      <a:avLst/>
+                    </a:prstGeom>
+                  </pic:spPr>
+                </pic:pic>
+              </a:graphicData>
+            </a:graphic>
+          </wp:inline>
+        </w:drawing>
+      </w:r>
+    </w:p>
+    <w:p>
+      <w:pPr>
+        <w:jc w:val="center"/>
+      </w:pPr>
+      <w:r>
+        <w:rPr>
+          <w:i/>
+          <w:sz w:val="20"/>
+        </w:rPr>
+        <w:t>Figura 6. Archivos de seguimiento de la base consolidada publicados en GitHub.</w:t>
+      </w:r>
+    </w:p>
+    <w:p>
+      <w:r>
+        <w:rPr>
+          <w:b/>
+          <w:sz w:val="22"/>
+        </w:rPr>
+        <w:t>6.3. Verificación y trabajo colaborativo</w:t>
+      </w:r>
+    </w:p>
+    <w:p>
+      <w:r>
+        <w:rPr>
+          <w:sz w:val="22"/>
+        </w:rPr>
+        <w:t xml:space="preserve">Se comprobó que DVC reconoce la versión registrada de la base y que Git no presenta cambios locales pendientes. El historial de commits permite identificar la creación de la estructura, la inicialización de DVC y el registro de los datos. También evidencia la incorporación de archivos por parte de </w:t>
+      </w:r>
+      <w:r>
+        <w:rPr>
+          <w:sz w:val="22"/>
+        </w:rPr>
+        <w:t>los demás integrantes del equipo.</w:t>
+      </w:r>
+    </w:p>
+    <w:p>
+      <w:pPr>
+        <w:jc w:val="center"/>
+      </w:pPr>
+      <w:r>
+        <w:rPr>
+          <w:noProof/>
+        </w:rPr>
+        <w:lastRenderedPageBreak/>
+        <w:drawing>
+          <wp:inline distT="0" distB="0" distL="0" distR="0" wp14:anchorId="5A6203BF" wp14:editId="60BDACB3">
+            <wp:extent cx="6400800" cy="2955925"/>
+            <wp:effectExtent l="0" t="0" r="0" b="0"/>
+            <wp:docPr id="348681913" name="Imagen 1"/>
+            <wp:cNvGraphicFramePr>
+              <a:graphicFrameLocks xmlns:a="http://schemas.openxmlformats.org/drawingml/2006/main" noChangeAspect="1"/>
+            </wp:cNvGraphicFramePr>
+            <a:graphic xmlns:a="http://schemas.openxmlformats.org/drawingml/2006/main">
+              <a:graphicData uri="http://schemas.openxmlformats.org/drawingml/2006/picture">
+                <pic:pic xmlns:pic="http://schemas.openxmlformats.org/drawingml/2006/picture">
+                  <pic:nvPicPr>
+                    <pic:cNvPr id="348681913" name=""/>
+                    <pic:cNvPicPr/>
+                  </pic:nvPicPr>
+                  <pic:blipFill>
+                    <a:blip r:embed="rId12"/>
+                    <a:stretch>
+                      <a:fillRect/>
+                    </a:stretch>
+                  </pic:blipFill>
+                  <pic:spPr>
+                    <a:xfrm>
+                      <a:off x="0" y="0"/>
+                      <a:ext cx="6400800" cy="2955925"/>
+                    </a:xfrm>
+                    <a:prstGeom prst="rect">
+                      <a:avLst/>
+                    </a:prstGeom>
+                  </pic:spPr>
+                </pic:pic>
+              </a:graphicData>
+            </a:graphic>
+          </wp:inline>
+        </w:drawing>
+      </w:r>
+    </w:p>
+    <w:p>
+      <w:pPr>
+        <w:jc w:val="center"/>
+      </w:pPr>
+      <w:r>
+        <w:rPr>
+          <w:i/>
+          <w:sz w:val="20"/>
+        </w:rPr>
+        <w:t>Figura 7. Historial de commits del repositorio y contribuciones del equipo.</w:t>
+      </w:r>
+    </w:p>
+    <w:p>
       <w:pPr>
         <w:jc w:val="both"/>
         <w:rPr>
@@ -8356,7 +8336,6 @@
           <w:sz w:val="22"/>
           <w:szCs w:val="22"/>
         </w:rPr>
-        <w:lastRenderedPageBreak/>
         <w:t xml:space="preserve">Banca de las Oportunidades. (2025). </w:t>
       </w:r>
       <w:r>
@@ -8368,7 +8347,7 @@
         </w:rPr>
         <w:t xml:space="preserve">Reporte trimestral de inclusión financiera en Colombia, marzo de 2025. </w:t>
       </w:r>
-      <w:hyperlink r:id="rId10" w:history="1">
+      <w:hyperlink r:id="rId13" w:history="1">
         <w:r>
           <w:rPr>
             <w:rStyle w:val="Hipervnculo"/>
@@ -8406,7 +8385,7 @@
         </w:rPr>
         <w:t xml:space="preserve"> Reporte de Inclusión Financiera 2025. </w:t>
       </w:r>
-      <w:hyperlink r:id="rId11" w:history="1">
+      <w:hyperlink r:id="rId14" w:history="1">
         <w:r>
           <w:rPr>
             <w:rStyle w:val="Hipervnculo"/>
@@ -8420,31 +8399,23 @@
       </w:hyperlink>
     </w:p>
     <w:p>
-      <w:pPr>
+      <w:r>
+        <w:rPr>
+          <w:sz w:val="22"/>
+          <w:szCs w:val="22"/>
+        </w:rPr>
+        <w:t>Departamento Administrativo Nacional de Estadística. (2022).</w:t>
+      </w:r>
+      <w:r>
         <w:rPr>
           <w:i/>
           <w:iCs/>
           <w:sz w:val="22"/>
           <w:szCs w:val="22"/>
         </w:rPr>
-      </w:pPr>
-      <w:r>
-        <w:rPr>
-          <w:sz w:val="22"/>
-          <w:szCs w:val="22"/>
-        </w:rPr>
-        <w:t>Departamento Administrativo Nacional de Estadística. (2022).</w:t>
-      </w:r>
-      <w:r>
-        <w:rPr>
-          <w:i/>
-          <w:iCs/>
-          <w:sz w:val="22"/>
-          <w:szCs w:val="22"/>
-        </w:rPr>
         <w:t xml:space="preserve"> Encuesta Longitudinal de Colombia (ELCO) 2022 [Diccionario de datos]. </w:t>
       </w:r>
-      <w:hyperlink r:id="rId12" w:history="1">
+      <w:hyperlink r:id="rId15" w:history="1">
         <w:r>
           <w:rPr>
             <w:rStyle w:val="Hipervnculo"/>
@@ -8456,6 +8427,70 @@
           <w:t>https://microdatos.dane.gov.co/index.php/catalog/902/data-dictionary/F36</w:t>
         </w:r>
       </w:hyperlink>
+    </w:p>
+    <w:p>
+      <w:pPr>
+        <w:rPr>
+          <w:i/>
+          <w:iCs/>
+          <w:sz w:val="22"/>
+          <w:szCs w:val="22"/>
+        </w:rPr>
+      </w:pPr>
+      <w:r>
+        <w:rPr>
+          <w:sz w:val="22"/>
+        </w:rPr>
+        <w:t>Repositori</w:t>
+      </w:r>
+      <w:r>
+        <w:rPr>
+          <w:sz w:val="22"/>
+        </w:rPr>
+        <w:t xml:space="preserve">o. </w:t>
+      </w:r>
+      <w:hyperlink r:id="rId16" w:history="1">
+        <w:r>
+          <w:rPr>
+            <w:rStyle w:val="Hipervnculo"/>
+            <w:i/>
+            <w:iCs/>
+            <w:sz w:val="22"/>
+            <w:szCs w:val="22"/>
+          </w:rPr>
+          <w:t>https://github.com/Nsegura57</w:t>
+        </w:r>
+        <w:r>
+          <w:rPr>
+            <w:rStyle w:val="Hipervnculo"/>
+            <w:i/>
+            <w:iCs/>
+            <w:sz w:val="22"/>
+            <w:szCs w:val="22"/>
+          </w:rPr>
+          <w:t>/</w:t>
+        </w:r>
+        <w:r>
+          <w:rPr>
+            <w:rStyle w:val="Hipervnculo"/>
+            <w:i/>
+            <w:iCs/>
+            <w:sz w:val="22"/>
+            <w:szCs w:val="22"/>
+          </w:rPr>
+          <w:t>Proyecto-Grupo-19</w:t>
+        </w:r>
+      </w:hyperlink>
+    </w:p>
+    <w:p>
+      <w:pPr>
+        <w:rPr>
+          <w:i/>
+          <w:iCs/>
+          <w:sz w:val="22"/>
+          <w:szCs w:val="22"/>
+        </w:rPr>
+      </w:pPr>
     </w:p>
     <w:sectPr>
       <w:pgSz w:w="12240" w:h="15840"/>
@@ -9682,6 +9717,7 @@
   <w:style w:type="character" w:default="1" w:styleId="Fuentedeprrafopredeter">
     <w:name w:val="Default Paragraph Font"/>
     <w:uiPriority w:val="1"/>
+    <w:semiHidden/>
     <w:unhideWhenUsed/>
   </w:style>
   <w:style w:type="table" w:default="1" w:styleId="Tablanormal">
@@ -10018,6 +10054,18 @@
       <w:shd w:val="clear" w:color="auto" w:fill="E1DFDD"/>
     </w:rPr>
   </w:style>
+  <w:style w:type="character" w:styleId="Hipervnculovisitado">
+    <w:name w:val="FollowedHyperlink"/>
+    <w:basedOn w:val="Fuentedeprrafopredeter"/>
+    <w:uiPriority w:val="99"/>
+    <w:semiHidden/>
+    <w:unhideWhenUsed/>
+    <w:rsid w:val="00937B1C"/>
+    <w:rPr>
+      <w:color w:val="96607D" w:themeColor="followedHyperlink"/>
+      <w:u w:val="single"/>
+    </w:rPr>
+  </w:style>
 </w:styles>
 </file>
 

</xml_diff>